<commit_message>
changes to various md files
</commit_message>
<xml_diff>
--- a/prompts/prompt-version-history.docx
+++ b/prompts/prompt-version-history.docx
@@ -1637,16 +1637,17 @@
         <w:tblLook w:firstColumn="1" w:firstRow="1" w:lastColumn="0" w:lastRow="0" w:noHBand="0" w:noVBand="1" w:val="04A0"/>
       </w:tblPr>
       <w:tblGrid>
-        <w:gridCol w:w="1728"/>
-        <w:gridCol w:w="1728"/>
-        <w:gridCol w:w="1728"/>
-        <w:gridCol w:w="1728"/>
-        <w:gridCol w:w="1728"/>
+        <w:gridCol w:w="1440"/>
+        <w:gridCol w:w="1440"/>
+        <w:gridCol w:w="1440"/>
+        <w:gridCol w:w="1440"/>
+        <w:gridCol w:w="1440"/>
+        <w:gridCol w:w="1440"/>
       </w:tblGrid>
       <w:tr>
         <w:tc>
           <w:tcPr>
-            <w:tcW w:type="dxa" w:w="1728"/>
+            <w:tcW w:type="dxa" w:w="1440"/>
             <w:shd w:val="clear" w:fill="D9E2F3"/>
           </w:tcPr>
           <w:p>
@@ -1661,7 +1662,7 @@
         </w:tc>
         <w:tc>
           <w:tcPr>
-            <w:tcW w:type="dxa" w:w="1728"/>
+            <w:tcW w:type="dxa" w:w="1440"/>
             <w:shd w:val="clear" w:fill="D9E2F3"/>
           </w:tcPr>
           <w:p>
@@ -1676,7 +1677,7 @@
         </w:tc>
         <w:tc>
           <w:tcPr>
-            <w:tcW w:type="dxa" w:w="1728"/>
+            <w:tcW w:type="dxa" w:w="1440"/>
             <w:shd w:val="clear" w:fill="D9E2F3"/>
           </w:tcPr>
           <w:p>
@@ -1691,7 +1692,7 @@
         </w:tc>
         <w:tc>
           <w:tcPr>
-            <w:tcW w:type="dxa" w:w="1728"/>
+            <w:tcW w:type="dxa" w:w="1440"/>
             <w:shd w:val="clear" w:fill="D9E2F3"/>
           </w:tcPr>
           <w:p>
@@ -1700,13 +1701,13 @@
               <w:rPr>
                 <w:b/>
               </w:rPr>
-              <w:t>v2.0 draft A</w:t>
+              <w:t>draft A</w:t>
             </w:r>
           </w:p>
         </w:tc>
         <w:tc>
           <w:tcPr>
-            <w:tcW w:type="dxa" w:w="1728"/>
+            <w:tcW w:type="dxa" w:w="1440"/>
             <w:shd w:val="clear" w:fill="D9E2F3"/>
           </w:tcPr>
           <w:p>
@@ -1715,7 +1716,22 @@
               <w:rPr>
                 <w:b/>
               </w:rPr>
-              <w:t>v2.0 draft B</w:t>
+              <w:t>draft B</w:t>
+            </w:r>
+          </w:p>
+        </w:tc>
+        <w:tc>
+          <w:tcPr>
+            <w:tcW w:type="dxa" w:w="1440"/>
+            <w:shd w:val="clear" w:fill="D9E2F3"/>
+          </w:tcPr>
+          <w:p>
+            <w:r/>
+            <w:r>
+              <w:rPr>
+                <w:b/>
+              </w:rPr>
+              <w:t>v2.0 shipped</w:t>
             </w:r>
           </w:p>
         </w:tc>
@@ -1723,7 +1739,7 @@
       <w:tr>
         <w:tc>
           <w:tcPr>
-            <w:tcW w:type="dxa" w:w="1728"/>
+            <w:tcW w:type="dxa" w:w="1440"/>
           </w:tcPr>
           <w:p>
             <w:r/>
@@ -1734,7 +1750,7 @@
         </w:tc>
         <w:tc>
           <w:tcPr>
-            <w:tcW w:type="dxa" w:w="1728"/>
+            <w:tcW w:type="dxa" w:w="1440"/>
           </w:tcPr>
           <w:p>
             <w:r/>
@@ -1745,7 +1761,7 @@
         </w:tc>
         <w:tc>
           <w:tcPr>
-            <w:tcW w:type="dxa" w:w="1728"/>
+            <w:tcW w:type="dxa" w:w="1440"/>
           </w:tcPr>
           <w:p>
             <w:r/>
@@ -1756,7 +1772,7 @@
         </w:tc>
         <w:tc>
           <w:tcPr>
-            <w:tcW w:type="dxa" w:w="1728"/>
+            <w:tcW w:type="dxa" w:w="1440"/>
           </w:tcPr>
           <w:p>
             <w:r/>
@@ -1767,7 +1783,7 @@
         </w:tc>
         <w:tc>
           <w:tcPr>
-            <w:tcW w:type="dxa" w:w="1728"/>
+            <w:tcW w:type="dxa" w:w="1440"/>
           </w:tcPr>
           <w:p>
             <w:r/>
@@ -1776,11 +1792,22 @@
             </w:r>
           </w:p>
         </w:tc>
+        <w:tc>
+          <w:tcPr>
+            <w:tcW w:type="dxa" w:w="1440"/>
+          </w:tcPr>
+          <w:p>
+            <w:r/>
+            <w:r>
+              <w:t>Found</w:t>
+            </w:r>
+          </w:p>
+        </w:tc>
       </w:tr>
       <w:tr>
         <w:tc>
           <w:tcPr>
-            <w:tcW w:type="dxa" w:w="1728"/>
+            <w:tcW w:type="dxa" w:w="1440"/>
           </w:tcPr>
           <w:p>
             <w:r/>
@@ -1791,7 +1818,7 @@
         </w:tc>
         <w:tc>
           <w:tcPr>
-            <w:tcW w:type="dxa" w:w="1728"/>
+            <w:tcW w:type="dxa" w:w="1440"/>
           </w:tcPr>
           <w:p>
             <w:r/>
@@ -1802,7 +1829,7 @@
         </w:tc>
         <w:tc>
           <w:tcPr>
-            <w:tcW w:type="dxa" w:w="1728"/>
+            <w:tcW w:type="dxa" w:w="1440"/>
           </w:tcPr>
           <w:p>
             <w:r/>
@@ -1813,7 +1840,7 @@
         </w:tc>
         <w:tc>
           <w:tcPr>
-            <w:tcW w:type="dxa" w:w="1728"/>
+            <w:tcW w:type="dxa" w:w="1440"/>
           </w:tcPr>
           <w:p>
             <w:r/>
@@ -1824,7 +1851,7 @@
         </w:tc>
         <w:tc>
           <w:tcPr>
-            <w:tcW w:type="dxa" w:w="1728"/>
+            <w:tcW w:type="dxa" w:w="1440"/>
           </w:tcPr>
           <w:p>
             <w:r/>
@@ -1833,11 +1860,22 @@
             </w:r>
           </w:p>
         </w:tc>
+        <w:tc>
+          <w:tcPr>
+            <w:tcW w:type="dxa" w:w="1440"/>
+          </w:tcPr>
+          <w:p>
+            <w:r/>
+            <w:r>
+              <w:t>Found</w:t>
+            </w:r>
+          </w:p>
+        </w:tc>
       </w:tr>
       <w:tr>
         <w:tc>
           <w:tcPr>
-            <w:tcW w:type="dxa" w:w="1728"/>
+            <w:tcW w:type="dxa" w:w="1440"/>
           </w:tcPr>
           <w:p>
             <w:r/>
@@ -1848,7 +1886,7 @@
         </w:tc>
         <w:tc>
           <w:tcPr>
-            <w:tcW w:type="dxa" w:w="1728"/>
+            <w:tcW w:type="dxa" w:w="1440"/>
           </w:tcPr>
           <w:p>
             <w:r/>
@@ -1859,7 +1897,7 @@
         </w:tc>
         <w:tc>
           <w:tcPr>
-            <w:tcW w:type="dxa" w:w="1728"/>
+            <w:tcW w:type="dxa" w:w="1440"/>
           </w:tcPr>
           <w:p>
             <w:r/>
@@ -1870,7 +1908,7 @@
         </w:tc>
         <w:tc>
           <w:tcPr>
-            <w:tcW w:type="dxa" w:w="1728"/>
+            <w:tcW w:type="dxa" w:w="1440"/>
           </w:tcPr>
           <w:p>
             <w:r/>
@@ -1884,7 +1922,7 @@
         </w:tc>
         <w:tc>
           <w:tcPr>
-            <w:tcW w:type="dxa" w:w="1728"/>
+            <w:tcW w:type="dxa" w:w="1440"/>
           </w:tcPr>
           <w:p>
             <w:r/>
@@ -1893,11 +1931,22 @@
             </w:r>
           </w:p>
         </w:tc>
+        <w:tc>
+          <w:tcPr>
+            <w:tcW w:type="dxa" w:w="1440"/>
+          </w:tcPr>
+          <w:p>
+            <w:r/>
+            <w:r>
+              <w:t>Found</w:t>
+            </w:r>
+          </w:p>
+        </w:tc>
       </w:tr>
       <w:tr>
         <w:tc>
           <w:tcPr>
-            <w:tcW w:type="dxa" w:w="1728"/>
+            <w:tcW w:type="dxa" w:w="1440"/>
           </w:tcPr>
           <w:p>
             <w:r/>
@@ -1908,7 +1957,7 @@
         </w:tc>
         <w:tc>
           <w:tcPr>
-            <w:tcW w:type="dxa" w:w="1728"/>
+            <w:tcW w:type="dxa" w:w="1440"/>
           </w:tcPr>
           <w:p>
             <w:r/>
@@ -1919,7 +1968,7 @@
         </w:tc>
         <w:tc>
           <w:tcPr>
-            <w:tcW w:type="dxa" w:w="1728"/>
+            <w:tcW w:type="dxa" w:w="1440"/>
           </w:tcPr>
           <w:p>
             <w:r/>
@@ -1930,7 +1979,7 @@
         </w:tc>
         <w:tc>
           <w:tcPr>
-            <w:tcW w:type="dxa" w:w="1728"/>
+            <w:tcW w:type="dxa" w:w="1440"/>
           </w:tcPr>
           <w:p>
             <w:r/>
@@ -1941,7 +1990,7 @@
         </w:tc>
         <w:tc>
           <w:tcPr>
-            <w:tcW w:type="dxa" w:w="1728"/>
+            <w:tcW w:type="dxa" w:w="1440"/>
           </w:tcPr>
           <w:p>
             <w:r/>
@@ -1950,11 +1999,22 @@
             </w:r>
           </w:p>
         </w:tc>
+        <w:tc>
+          <w:tcPr>
+            <w:tcW w:type="dxa" w:w="1440"/>
+          </w:tcPr>
+          <w:p>
+            <w:r/>
+            <w:r>
+              <w:t>Found</w:t>
+            </w:r>
+          </w:p>
+        </w:tc>
       </w:tr>
       <w:tr>
         <w:tc>
           <w:tcPr>
-            <w:tcW w:type="dxa" w:w="1728"/>
+            <w:tcW w:type="dxa" w:w="1440"/>
           </w:tcPr>
           <w:p>
             <w:r/>
@@ -1965,7 +2025,7 @@
         </w:tc>
         <w:tc>
           <w:tcPr>
-            <w:tcW w:type="dxa" w:w="1728"/>
+            <w:tcW w:type="dxa" w:w="1440"/>
           </w:tcPr>
           <w:p>
             <w:r/>
@@ -1976,7 +2036,7 @@
         </w:tc>
         <w:tc>
           <w:tcPr>
-            <w:tcW w:type="dxa" w:w="1728"/>
+            <w:tcW w:type="dxa" w:w="1440"/>
           </w:tcPr>
           <w:p>
             <w:r/>
@@ -1990,7 +2050,7 @@
         </w:tc>
         <w:tc>
           <w:tcPr>
-            <w:tcW w:type="dxa" w:w="1728"/>
+            <w:tcW w:type="dxa" w:w="1440"/>
           </w:tcPr>
           <w:p>
             <w:r/>
@@ -2001,7 +2061,21 @@
         </w:tc>
         <w:tc>
           <w:tcPr>
-            <w:tcW w:type="dxa" w:w="1728"/>
+            <w:tcW w:type="dxa" w:w="1440"/>
+          </w:tcPr>
+          <w:p>
+            <w:r/>
+            <w:r>
+              <w:rPr>
+                <w:b/>
+              </w:rPr>
+              <w:t>Found 0.95</w:t>
+            </w:r>
+          </w:p>
+        </w:tc>
+        <w:tc>
+          <w:tcPr>
+            <w:tcW w:type="dxa" w:w="1440"/>
           </w:tcPr>
           <w:p>
             <w:r/>
@@ -2017,7 +2091,7 @@
       <w:tr>
         <w:tc>
           <w:tcPr>
-            <w:tcW w:type="dxa" w:w="1728"/>
+            <w:tcW w:type="dxa" w:w="1440"/>
           </w:tcPr>
           <w:p>
             <w:r/>
@@ -2028,7 +2102,7 @@
         </w:tc>
         <w:tc>
           <w:tcPr>
-            <w:tcW w:type="dxa" w:w="1728"/>
+            <w:tcW w:type="dxa" w:w="1440"/>
           </w:tcPr>
           <w:p>
             <w:r/>
@@ -2039,7 +2113,7 @@
         </w:tc>
         <w:tc>
           <w:tcPr>
-            <w:tcW w:type="dxa" w:w="1728"/>
+            <w:tcW w:type="dxa" w:w="1440"/>
           </w:tcPr>
           <w:p>
             <w:r/>
@@ -2050,7 +2124,7 @@
         </w:tc>
         <w:tc>
           <w:tcPr>
-            <w:tcW w:type="dxa" w:w="1728"/>
+            <w:tcW w:type="dxa" w:w="1440"/>
           </w:tcPr>
           <w:p>
             <w:r/>
@@ -2061,14 +2135,22 @@
         </w:tc>
         <w:tc>
           <w:tcPr>
-            <w:tcW w:type="dxa" w:w="1728"/>
+            <w:tcW w:type="dxa" w:w="1440"/>
           </w:tcPr>
           <w:p>
             <w:r/>
             <w:r>
-              <w:rPr>
-                <w:b/>
-              </w:rPr>
+              <w:t>Not Found 0.00</w:t>
+            </w:r>
+          </w:p>
+        </w:tc>
+        <w:tc>
+          <w:tcPr>
+            <w:tcW w:type="dxa" w:w="1440"/>
+          </w:tcPr>
+          <w:p>
+            <w:r/>
+            <w:r>
               <w:t>Not Found 0.00</w:t>
             </w:r>
           </w:p>
@@ -2077,7 +2159,7 @@
       <w:tr>
         <w:tc>
           <w:tcPr>
-            <w:tcW w:type="dxa" w:w="1728"/>
+            <w:tcW w:type="dxa" w:w="1440"/>
           </w:tcPr>
           <w:p>
             <w:r/>
@@ -2088,7 +2170,7 @@
         </w:tc>
         <w:tc>
           <w:tcPr>
-            <w:tcW w:type="dxa" w:w="1728"/>
+            <w:tcW w:type="dxa" w:w="1440"/>
           </w:tcPr>
           <w:p>
             <w:r/>
@@ -2099,7 +2181,7 @@
         </w:tc>
         <w:tc>
           <w:tcPr>
-            <w:tcW w:type="dxa" w:w="1728"/>
+            <w:tcW w:type="dxa" w:w="1440"/>
           </w:tcPr>
           <w:p>
             <w:r/>
@@ -2113,7 +2195,7 @@
         </w:tc>
         <w:tc>
           <w:tcPr>
-            <w:tcW w:type="dxa" w:w="1728"/>
+            <w:tcW w:type="dxa" w:w="1440"/>
           </w:tcPr>
           <w:p>
             <w:r/>
@@ -2124,7 +2206,21 @@
         </w:tc>
         <w:tc>
           <w:tcPr>
-            <w:tcW w:type="dxa" w:w="1728"/>
+            <w:tcW w:type="dxa" w:w="1440"/>
+          </w:tcPr>
+          <w:p>
+            <w:r/>
+            <w:r>
+              <w:rPr>
+                <w:b/>
+              </w:rPr>
+              <w:t>Found 0.95</w:t>
+            </w:r>
+          </w:p>
+        </w:tc>
+        <w:tc>
+          <w:tcPr>
+            <w:tcW w:type="dxa" w:w="1440"/>
           </w:tcPr>
           <w:p>
             <w:r/>
@@ -2140,7 +2236,7 @@
       <w:tr>
         <w:tc>
           <w:tcPr>
-            <w:tcW w:type="dxa" w:w="1728"/>
+            <w:tcW w:type="dxa" w:w="1440"/>
           </w:tcPr>
           <w:p>
             <w:r/>
@@ -2151,7 +2247,7 @@
         </w:tc>
         <w:tc>
           <w:tcPr>
-            <w:tcW w:type="dxa" w:w="1728"/>
+            <w:tcW w:type="dxa" w:w="1440"/>
           </w:tcPr>
           <w:p>
             <w:r/>
@@ -2162,7 +2258,7 @@
         </w:tc>
         <w:tc>
           <w:tcPr>
-            <w:tcW w:type="dxa" w:w="1728"/>
+            <w:tcW w:type="dxa" w:w="1440"/>
           </w:tcPr>
           <w:p>
             <w:r/>
@@ -2173,7 +2269,7 @@
         </w:tc>
         <w:tc>
           <w:tcPr>
-            <w:tcW w:type="dxa" w:w="1728"/>
+            <w:tcW w:type="dxa" w:w="1440"/>
           </w:tcPr>
           <w:p>
             <w:r/>
@@ -2184,14 +2280,22 @@
         </w:tc>
         <w:tc>
           <w:tcPr>
-            <w:tcW w:type="dxa" w:w="1728"/>
+            <w:tcW w:type="dxa" w:w="1440"/>
           </w:tcPr>
           <w:p>
             <w:r/>
             <w:r>
-              <w:rPr>
-                <w:b/>
-              </w:rPr>
+              <w:t>Not Found 0.00</w:t>
+            </w:r>
+          </w:p>
+        </w:tc>
+        <w:tc>
+          <w:tcPr>
+            <w:tcW w:type="dxa" w:w="1440"/>
+          </w:tcPr>
+          <w:p>
+            <w:r/>
+            <w:r>
               <w:t>Not Found 0.00</w:t>
             </w:r>
           </w:p>
@@ -2200,7 +2304,7 @@
       <w:tr>
         <w:tc>
           <w:tcPr>
-            <w:tcW w:type="dxa" w:w="1728"/>
+            <w:tcW w:type="dxa" w:w="1440"/>
           </w:tcPr>
           <w:p>
             <w:r/>
@@ -2211,7 +2315,7 @@
         </w:tc>
         <w:tc>
           <w:tcPr>
-            <w:tcW w:type="dxa" w:w="1728"/>
+            <w:tcW w:type="dxa" w:w="1440"/>
           </w:tcPr>
           <w:p>
             <w:r/>
@@ -2222,7 +2326,7 @@
         </w:tc>
         <w:tc>
           <w:tcPr>
-            <w:tcW w:type="dxa" w:w="1728"/>
+            <w:tcW w:type="dxa" w:w="1440"/>
           </w:tcPr>
           <w:p>
             <w:r/>
@@ -2233,7 +2337,7 @@
         </w:tc>
         <w:tc>
           <w:tcPr>
-            <w:tcW w:type="dxa" w:w="1728"/>
+            <w:tcW w:type="dxa" w:w="1440"/>
           </w:tcPr>
           <w:p>
             <w:r/>
@@ -2244,14 +2348,22 @@
         </w:tc>
         <w:tc>
           <w:tcPr>
-            <w:tcW w:type="dxa" w:w="1728"/>
+            <w:tcW w:type="dxa" w:w="1440"/>
           </w:tcPr>
           <w:p>
             <w:r/>
             <w:r>
-              <w:rPr>
-                <w:b/>
-              </w:rPr>
+              <w:t>Not Found 0.00</w:t>
+            </w:r>
+          </w:p>
+        </w:tc>
+        <w:tc>
+          <w:tcPr>
+            <w:tcW w:type="dxa" w:w="1440"/>
+          </w:tcPr>
+          <w:p>
+            <w:r/>
+            <w:r>
               <w:t>Not Found 0.00</w:t>
             </w:r>
           </w:p>
@@ -2260,7 +2372,7 @@
       <w:tr>
         <w:tc>
           <w:tcPr>
-            <w:tcW w:type="dxa" w:w="1728"/>
+            <w:tcW w:type="dxa" w:w="1440"/>
           </w:tcPr>
           <w:p>
             <w:r/>
@@ -2271,7 +2383,7 @@
         </w:tc>
         <w:tc>
           <w:tcPr>
-            <w:tcW w:type="dxa" w:w="1728"/>
+            <w:tcW w:type="dxa" w:w="1440"/>
           </w:tcPr>
           <w:p>
             <w:r/>
@@ -2282,7 +2394,7 @@
         </w:tc>
         <w:tc>
           <w:tcPr>
-            <w:tcW w:type="dxa" w:w="1728"/>
+            <w:tcW w:type="dxa" w:w="1440"/>
           </w:tcPr>
           <w:p>
             <w:r/>
@@ -2293,7 +2405,7 @@
         </w:tc>
         <w:tc>
           <w:tcPr>
-            <w:tcW w:type="dxa" w:w="1728"/>
+            <w:tcW w:type="dxa" w:w="1440"/>
           </w:tcPr>
           <w:p>
             <w:r/>
@@ -2304,14 +2416,22 @@
         </w:tc>
         <w:tc>
           <w:tcPr>
-            <w:tcW w:type="dxa" w:w="1728"/>
+            <w:tcW w:type="dxa" w:w="1440"/>
           </w:tcPr>
           <w:p>
             <w:r/>
             <w:r>
-              <w:rPr>
-                <w:b/>
-              </w:rPr>
+              <w:t>Not Found 0.00</w:t>
+            </w:r>
+          </w:p>
+        </w:tc>
+        <w:tc>
+          <w:tcPr>
+            <w:tcW w:type="dxa" w:w="1440"/>
+          </w:tcPr>
+          <w:p>
+            <w:r/>
+            <w:r>
               <w:t>Not Found 0.00</w:t>
             </w:r>
           </w:p>
@@ -2320,7 +2440,7 @@
       <w:tr>
         <w:tc>
           <w:tcPr>
-            <w:tcW w:type="dxa" w:w="1728"/>
+            <w:tcW w:type="dxa" w:w="1440"/>
           </w:tcPr>
           <w:p>
             <w:r/>
@@ -2334,7 +2454,7 @@
         </w:tc>
         <w:tc>
           <w:tcPr>
-            <w:tcW w:type="dxa" w:w="1728"/>
+            <w:tcW w:type="dxa" w:w="1440"/>
           </w:tcPr>
           <w:p>
             <w:r/>
@@ -2342,7 +2462,7 @@
         </w:tc>
         <w:tc>
           <w:tcPr>
-            <w:tcW w:type="dxa" w:w="1728"/>
+            <w:tcW w:type="dxa" w:w="1440"/>
           </w:tcPr>
           <w:p>
             <w:r/>
@@ -2356,7 +2476,7 @@
         </w:tc>
         <w:tc>
           <w:tcPr>
-            <w:tcW w:type="dxa" w:w="1728"/>
+            <w:tcW w:type="dxa" w:w="1440"/>
           </w:tcPr>
           <w:p>
             <w:r/>
@@ -2370,7 +2490,21 @@
         </w:tc>
         <w:tc>
           <w:tcPr>
-            <w:tcW w:type="dxa" w:w="1728"/>
+            <w:tcW w:type="dxa" w:w="1440"/>
+          </w:tcPr>
+          <w:p>
+            <w:r/>
+            <w:r>
+              <w:rPr>
+                <w:b/>
+              </w:rPr>
+              <w:t>8 of 10</w:t>
+            </w:r>
+          </w:p>
+        </w:tc>
+        <w:tc>
+          <w:tcPr>
+            <w:tcW w:type="dxa" w:w="1440"/>
           </w:tcPr>
           <w:p>
             <w:r/>
@@ -2387,7 +2521,7 @@
     <w:p/>
     <w:p>
       <w:r>
-        <w:t xml:space="preserve">The single most important line in the table is not the score. It is that v1.0 returned "Not Found" </w:t>
+        <w:t xml:space="preserve">The single most important line here is not the score. v1.0 returned "Not Found" </w:t>
       </w:r>
       <w:r>
         <w:rPr>
@@ -2396,7 +2530,302 @@
         <w:t>zero times in nineteen cases</w:t>
       </w:r>
       <w:r>
-        <w:t>, and draft B returns it four times, correctly. The system could not previously report a missing document at all. That was the defect Johnson's iteration record predicted and the baseline confirmed, and it is now closed.</w:t>
+        <w:t>. v2.0 returns it correctly wherever the document is genuinely absent and nothing closely resembling it sits nearby. The system previously could not report a missing document at all, which was the defect Johnson's iteration record predicted and the baseline confirmed. That is now closed.</w:t>
+      </w:r>
+    </w:p>
+    <w:p>
+      <w:pPr>
+        <w:pStyle w:val="Heading3"/>
+      </w:pPr>
+      <w:r>
+        <w:t>6.2.1 Full evaluation, the authoritative comparison</w:t>
+      </w:r>
+    </w:p>
+    <w:p>
+      <w:r>
+        <w:t>The shipped prompt was then run against the complete 19-case evaluation, on the same harness and settings that produced the v1.0 baseline. The probe table above is the tuning loop; this is the result that counts.</w:t>
+      </w:r>
+    </w:p>
+    <w:tbl>
+      <w:tblPr>
+        <w:tblStyle w:val="TableGrid"/>
+        <w:tblW w:type="auto" w:w="0"/>
+        <w:jc w:val="center"/>
+        <w:tblLook w:firstColumn="1" w:firstRow="1" w:lastColumn="0" w:lastRow="0" w:noHBand="0" w:noVBand="1" w:val="04A0"/>
+      </w:tblPr>
+      <w:tblGrid>
+        <w:gridCol w:w="2880"/>
+        <w:gridCol w:w="2880"/>
+        <w:gridCol w:w="2880"/>
+      </w:tblGrid>
+      <w:tr>
+        <w:tc>
+          <w:tcPr>
+            <w:tcW w:type="dxa" w:w="2880"/>
+            <w:shd w:val="clear" w:fill="D9E2F3"/>
+          </w:tcPr>
+          <w:p>
+            <w:r/>
+            <w:r>
+              <w:rPr>
+                <w:b/>
+              </w:rPr>
+              <w:t>Measure</w:t>
+            </w:r>
+          </w:p>
+        </w:tc>
+        <w:tc>
+          <w:tcPr>
+            <w:tcW w:type="dxa" w:w="2880"/>
+            <w:shd w:val="clear" w:fill="D9E2F3"/>
+          </w:tcPr>
+          <w:p>
+            <w:r/>
+            <w:r>
+              <w:rPr>
+                <w:b/>
+              </w:rPr>
+              <w:t>v1.0</w:t>
+            </w:r>
+          </w:p>
+        </w:tc>
+        <w:tc>
+          <w:tcPr>
+            <w:tcW w:type="dxa" w:w="2880"/>
+            <w:shd w:val="clear" w:fill="D9E2F3"/>
+          </w:tcPr>
+          <w:p>
+            <w:r/>
+            <w:r>
+              <w:rPr>
+                <w:b/>
+              </w:rPr>
+              <w:t>v2.0</w:t>
+            </w:r>
+          </w:p>
+        </w:tc>
+      </w:tr>
+      <w:tr>
+        <w:tc>
+          <w:tcPr>
+            <w:tcW w:type="dxa" w:w="2880"/>
+          </w:tcPr>
+          <w:p>
+            <w:r/>
+            <w:r>
+              <w:t>Cases meeting expectation</w:t>
+            </w:r>
+          </w:p>
+        </w:tc>
+        <w:tc>
+          <w:tcPr>
+            <w:tcW w:type="dxa" w:w="2880"/>
+          </w:tcPr>
+          <w:p>
+            <w:r/>
+            <w:r>
+              <w:t>15 of 19</w:t>
+            </w:r>
+          </w:p>
+        </w:tc>
+        <w:tc>
+          <w:tcPr>
+            <w:tcW w:type="dxa" w:w="2880"/>
+          </w:tcPr>
+          <w:p>
+            <w:r/>
+            <w:r>
+              <w:rPr>
+                <w:b/>
+              </w:rPr>
+              <w:t>17 of 19</w:t>
+            </w:r>
+          </w:p>
+        </w:tc>
+      </w:tr>
+      <w:tr>
+        <w:tc>
+          <w:tcPr>
+            <w:tcW w:type="dxa" w:w="2880"/>
+          </w:tcPr>
+          <w:p>
+            <w:r/>
+            <w:r>
+              <w:t>Times a required document was reported absent</w:t>
+            </w:r>
+          </w:p>
+        </w:tc>
+        <w:tc>
+          <w:tcPr>
+            <w:tcW w:type="dxa" w:w="2880"/>
+          </w:tcPr>
+          <w:p>
+            <w:r/>
+            <w:r>
+              <w:t>never</w:t>
+            </w:r>
+          </w:p>
+        </w:tc>
+        <w:tc>
+          <w:tcPr>
+            <w:tcW w:type="dxa" w:w="2880"/>
+          </w:tcPr>
+          <w:p>
+            <w:r/>
+            <w:r>
+              <w:t>correctly on 4 of the 6 absent items</w:t>
+            </w:r>
+          </w:p>
+        </w:tc>
+      </w:tr>
+      <w:tr>
+        <w:tc>
+          <w:tcPr>
+            <w:tcW w:type="dxa" w:w="2880"/>
+          </w:tcPr>
+          <w:p>
+            <w:r/>
+            <w:r>
+              <w:t>EV-18, a submission containing none of the required documents</w:t>
+            </w:r>
+          </w:p>
+        </w:tc>
+        <w:tc>
+          <w:tcPr>
+            <w:tcW w:type="dxa" w:w="2880"/>
+          </w:tcPr>
+          <w:p>
+            <w:r/>
+            <w:r>
+              <w:t>0 of 3 Not Found</w:t>
+            </w:r>
+          </w:p>
+        </w:tc>
+        <w:tc>
+          <w:tcPr>
+            <w:tcW w:type="dxa" w:w="2880"/>
+          </w:tcPr>
+          <w:p>
+            <w:r/>
+            <w:r>
+              <w:rPr>
+                <w:b/>
+              </w:rPr>
+              <w:t>3 of 3 Not Found</w:t>
+            </w:r>
+          </w:p>
+        </w:tc>
+      </w:tr>
+      <w:tr>
+        <w:tc>
+          <w:tcPr>
+            <w:tcW w:type="dxa" w:w="2880"/>
+          </w:tcPr>
+          <w:p>
+            <w:r/>
+            <w:r>
+              <w:t>Safety boundary, EV-08 to EV-11 and EV-14</w:t>
+            </w:r>
+          </w:p>
+        </w:tc>
+        <w:tc>
+          <w:tcPr>
+            <w:tcW w:type="dxa" w:w="2880"/>
+          </w:tcPr>
+          <w:p>
+            <w:r/>
+            <w:r>
+              <w:t>all pass</w:t>
+            </w:r>
+          </w:p>
+        </w:tc>
+        <w:tc>
+          <w:tcPr>
+            <w:tcW w:type="dxa" w:w="2880"/>
+          </w:tcPr>
+          <w:p>
+            <w:r/>
+            <w:r>
+              <w:t>all pass</w:t>
+            </w:r>
+          </w:p>
+        </w:tc>
+      </w:tr>
+      <w:tr>
+        <w:tc>
+          <w:tcPr>
+            <w:tcW w:type="dxa" w:w="2880"/>
+          </w:tcPr>
+          <w:p>
+            <w:r/>
+            <w:r>
+              <w:t>Format and validation, EV-12, EV-13, EV-15 to EV-17, EV-19</w:t>
+            </w:r>
+          </w:p>
+        </w:tc>
+        <w:tc>
+          <w:tcPr>
+            <w:tcW w:type="dxa" w:w="2880"/>
+          </w:tcPr>
+          <w:p>
+            <w:r/>
+            <w:r>
+              <w:t>all pass</w:t>
+            </w:r>
+          </w:p>
+        </w:tc>
+        <w:tc>
+          <w:tcPr>
+            <w:tcW w:type="dxa" w:w="2880"/>
+          </w:tcPr>
+          <w:p>
+            <w:r/>
+            <w:r>
+              <w:t>all pass</w:t>
+            </w:r>
+          </w:p>
+        </w:tc>
+      </w:tr>
+      <w:tr>
+        <w:tc>
+          <w:tcPr>
+            <w:tcW w:type="dxa" w:w="2880"/>
+          </w:tcPr>
+          <w:p>
+            <w:r/>
+            <w:r>
+              <w:t>Remaining failures</w:t>
+            </w:r>
+          </w:p>
+        </w:tc>
+        <w:tc>
+          <w:tcPr>
+            <w:tcW w:type="dxa" w:w="2880"/>
+          </w:tcPr>
+          <w:p>
+            <w:r/>
+            <w:r>
+              <w:t>EV-05, EV-06, EV-07, EV-18</w:t>
+            </w:r>
+          </w:p>
+        </w:tc>
+        <w:tc>
+          <w:tcPr>
+            <w:tcW w:type="dxa" w:w="2880"/>
+          </w:tcPr>
+          <w:p>
+            <w:r/>
+            <w:r>
+              <w:t>EV-05, EV-07</w:t>
+            </w:r>
+          </w:p>
+        </w:tc>
+      </w:tr>
+    </w:tbl>
+    <w:p/>
+    <w:p>
+      <w:r>
+        <w:t>Both generated tables name their prompt version in the header, so neither run can be mistaken for the other.</w:t>
       </w:r>
     </w:p>
     <w:p>
@@ -2514,31 +2943,215 @@
     </w:p>
     <w:p>
       <w:r>
-        <w:t>EV-05 and EV-07 remain wrong in draft B, and they fail in the same way: a related document sits elsewhere in the same submission, and the model accepts it at confidence 0.95. The submission contains a Declaration of Interest but no anti-bribery declaration, and a Tax Clearance Certificate but no certificate of non-blacklisting.</w:t>
+        <w:t>EV-05 and EV-07 fail in v2.0, and they fail the same way. A related document sits elsewhere in the same submission and the model accepts it at confidence 0.95.</w:t>
+      </w:r>
+    </w:p>
+    <w:tbl>
+      <w:tblPr>
+        <w:tblStyle w:val="TableGrid"/>
+        <w:tblW w:type="auto" w:w="0"/>
+        <w:jc w:val="center"/>
+        <w:tblLook w:firstColumn="1" w:firstRow="1" w:lastColumn="0" w:lastRow="0" w:noHBand="0" w:noVBand="1" w:val="04A0"/>
+      </w:tblPr>
+      <w:tblGrid>
+        <w:gridCol w:w="2160"/>
+        <w:gridCol w:w="2160"/>
+        <w:gridCol w:w="2160"/>
+        <w:gridCol w:w="2160"/>
+      </w:tblGrid>
+      <w:tr>
+        <w:tc>
+          <w:tcPr>
+            <w:tcW w:type="dxa" w:w="2160"/>
+            <w:shd w:val="clear" w:fill="D9E2F3"/>
+          </w:tcPr>
+          <w:p>
+            <w:r/>
+            <w:r>
+              <w:rPr>
+                <w:b/>
+              </w:rPr>
+              <w:t>Case</w:t>
+            </w:r>
+          </w:p>
+        </w:tc>
+        <w:tc>
+          <w:tcPr>
+            <w:tcW w:type="dxa" w:w="2160"/>
+            <w:shd w:val="clear" w:fill="D9E2F3"/>
+          </w:tcPr>
+          <w:p>
+            <w:r/>
+            <w:r>
+              <w:rPr>
+                <w:b/>
+              </w:rPr>
+              <w:t>Required</w:t>
+            </w:r>
+          </w:p>
+        </w:tc>
+        <w:tc>
+          <w:tcPr>
+            <w:tcW w:type="dxa" w:w="2160"/>
+            <w:shd w:val="clear" w:fill="D9E2F3"/>
+          </w:tcPr>
+          <w:p>
+            <w:r/>
+            <w:r>
+              <w:rPr>
+                <w:b/>
+              </w:rPr>
+              <w:t>Submission actually contains</w:t>
+            </w:r>
+          </w:p>
+        </w:tc>
+        <w:tc>
+          <w:tcPr>
+            <w:tcW w:type="dxa" w:w="2160"/>
+            <w:shd w:val="clear" w:fill="D9E2F3"/>
+          </w:tcPr>
+          <w:p>
+            <w:r/>
+            <w:r>
+              <w:rPr>
+                <w:b/>
+              </w:rPr>
+              <w:t>v2.0 quoted</w:t>
+            </w:r>
+          </w:p>
+        </w:tc>
+      </w:tr>
+      <w:tr>
+        <w:tc>
+          <w:tcPr>
+            <w:tcW w:type="dxa" w:w="2160"/>
+          </w:tcPr>
+          <w:p>
+            <w:r/>
+            <w:r>
+              <w:t>EV-05</w:t>
+            </w:r>
+          </w:p>
+        </w:tc>
+        <w:tc>
+          <w:tcPr>
+            <w:tcW w:type="dxa" w:w="2160"/>
+          </w:tcPr>
+          <w:p>
+            <w:r/>
+            <w:r>
+              <w:t>Anti-bribery declaration</w:t>
+            </w:r>
+          </w:p>
+        </w:tc>
+        <w:tc>
+          <w:tcPr>
+            <w:tcW w:type="dxa" w:w="2160"/>
+          </w:tcPr>
+          <w:p>
+            <w:r/>
+            <w:r>
+              <w:t>A Declaration of Interest, page 7</w:t>
+            </w:r>
+          </w:p>
+        </w:tc>
+        <w:tc>
+          <w:tcPr>
+            <w:tcW w:type="dxa" w:w="2160"/>
+          </w:tcPr>
+          <w:p>
+            <w:r/>
+            <w:r>
+              <w:t>"The bidder confirms that no director, officer or shareholder of Kavuma..."</w:t>
+            </w:r>
+          </w:p>
+        </w:tc>
+      </w:tr>
+      <w:tr>
+        <w:tc>
+          <w:tcPr>
+            <w:tcW w:type="dxa" w:w="2160"/>
+          </w:tcPr>
+          <w:p>
+            <w:r/>
+            <w:r>
+              <w:t>EV-07</w:t>
+            </w:r>
+          </w:p>
+        </w:tc>
+        <w:tc>
+          <w:tcPr>
+            <w:tcW w:type="dxa" w:w="2160"/>
+          </w:tcPr>
+          <w:p>
+            <w:r/>
+            <w:r>
+              <w:t>Certificate of non-blacklisting</w:t>
+            </w:r>
+          </w:p>
+        </w:tc>
+        <w:tc>
+          <w:tcPr>
+            <w:tcW w:type="dxa" w:w="2160"/>
+          </w:tcPr>
+          <w:p>
+            <w:r/>
+            <w:r>
+              <w:t>A Certificate of Registration, page 2</w:t>
+            </w:r>
+          </w:p>
+        </w:tc>
+        <w:tc>
+          <w:tcPr>
+            <w:tcW w:type="dxa" w:w="2160"/>
+          </w:tcPr>
+          <w:p>
+            <w:r/>
+            <w:r>
+              <w:t>"Attached as Appendix A is the Certificate of Registration of the Compa..."</w:t>
+            </w:r>
+          </w:p>
+        </w:tc>
+      </w:tr>
+    </w:tbl>
+    <w:p/>
+    <w:p>
+      <w:r>
+        <w:t>Three prompt formulations were tried against these two cases. Draft B allowed a document "that serves the requirement's purpose", which is exactly the reasoning that lets a declaration of interest pass as an anti-bribery declaration. The shipped version replaced that with a concrete discriminator: could one physical document carry both names, and would a complete submission contain both? Neither formulation moved EV-05 or EV-07.</w:t>
       </w:r>
     </w:p>
     <w:p>
       <w:r>
-        <w:t>The cause is traceable to a phrase in draft B's identity test: a document "that serves the requirement's purpose" satisfies the requirement. That is exactly the reasoning by which a declaration of interest can be argued to serve the purpose of an anti-bribery declaration. Loosening the test enough to accept a synonym loosened it enough to accept a neighbour. This is the precision and recall trade in its plainest form, and it is the hardest part of the problem for an 8B model.</w:t>
+        <w:t>One detail is worth recording because it shows what is really happening. Under v1.0 and draft B, EV-07 quoted the Tax Clearance Certificate. Under the shipped version it quotes the Certificate of Registration instead. The model is not holding a stable wrong belief that it can be argued out of; it is selecting whichever passage is nearest to the requirement and presenting it as a match. The prompt changes altered which passage it picks, not whether it picks one.</w:t>
       </w:r>
     </w:p>
     <w:p>
       <w:r>
-        <w:t xml:space="preserve">The current prompt replaces that phrase with a sharper discriminator: </w:t>
+        <w:t>The honest conclusion is that this residual failure is unlikely to be fixed by prompt wording alone on an 8B model. Absence is now reportable, which was the substantive win, and absence against an empty field is reliable, as EV-18 shows. What remains is discriminating between two documents that share vocabulary, issuer and subject area, which is a harder judgement than the model can be talked into making.</w:t>
       </w:r>
+    </w:p>
+    <w:p>
+      <w:r>
+        <w:t>Two routes are open for v2.1, and both are structural rather than rhetorical:</w:t>
+      </w:r>
+    </w:p>
+    <w:p>
+      <w:pPr>
+        <w:pStyle w:val="ListBullet"/>
+      </w:pPr>
       <w:r>
         <w:rPr>
           <w:b/>
         </w:rPr>
-        <w:t>could one physical document carry both names?</w:t>
+        <w:t>Tighten the confidence bands in code.</w:t>
       </w:r>
       <w:r>
-        <w:t xml:space="preserve"> A balance sheet and a statement of financial position are one sheet of paper. A declaration of interest and an anti-bribery declaration are two documents that a complete submission would contain both of, so finding one cannot satisfy a requirement for the other. The final check asks the same question a second way before any item is reported present.</w:t>
+        <w:t xml:space="preserve"> The model reports 0.95 for these</w:t>
       </w:r>
     </w:p>
     <w:p>
       <w:r>
-        <w:t xml:space="preserve">That change is measured by the next full evaluation run rather than by the ten-probe subset, and its result belongs in </w:t>
+        <w:t xml:space="preserve">matches, comfortably above the 0.85 threshold. A second, cheaper verification call asking only "is this quoted text the required document, yes or no" would give </w:t>
       </w:r>
       <w:r>
         <w:rPr>
@@ -2546,10 +3159,34 @@
           <w:color w:val="B03060"/>
           <w:sz w:val="19"/>
         </w:rPr>
-        <w:t>docs/evaluation/prompt-evaluation-table.md</w:t>
+        <w:t>engine.py</w:t>
       </w:r>
       <w:r>
-        <w:t>, whose header records the prompt version that produced it.</w:t>
+        <w:t xml:space="preserve"> an independent signal instead of the model's self-assessment.</w:t>
+      </w:r>
+    </w:p>
+    <w:p>
+      <w:pPr>
+        <w:pStyle w:val="ListBullet"/>
+      </w:pPr>
+      <w:r>
+        <w:rPr>
+          <w:b/>
+        </w:rPr>
+        <w:t>Adopt Johnson's `explanation` field.</w:t>
+      </w:r>
+      <w:r>
+        <w:t xml:space="preserve"> A one-sentence justification would</w:t>
+      </w:r>
+    </w:p>
+    <w:p>
+      <w:r>
+        <w:t>make the faulty reasoning visible in the report itself, where a reviewer would catch it, rather than leaving a bare confidence number the threshold trusts.</w:t>
+      </w:r>
+    </w:p>
+    <w:p>
+      <w:r>
+        <w:t>Until one of those lands, the system's behaviour on this class of case should be stated plainly to any officer using it: a required document that has a close cousin elsewhere in the submission may still be reported present. The completeness check reduces the reviewer's work; it does not yet replace their reading of the near-miss items.</w:t>
       </w:r>
     </w:p>
     <w:p>

</xml_diff>